<commit_message>
docs: add project README and include updated documentation report in PDF format
</commit_message>
<xml_diff>
--- a/Student_Dropout_Risk_Predictor_Report_v2.docx
+++ b/Student_Dropout_Risk_Predictor_Report_v2.docx
@@ -190,7 +190,7 @@
           <w:szCs w:val="26"/>
           <w:lang w:val="en-GB"/>
         </w:rPr>
-        <w:t>Live Link:</w:t>
+        <w:t>Live Link: https://student-dropout-risk-predictor-main.streamlit.app</w:t>
       </w:r>
     </w:p>
     <w:p>
@@ -231,7 +231,7 @@
           <w:szCs w:val="26"/>
           <w:lang w:val="en-GB"/>
         </w:rPr>
-        <w:t>GitHub LInk:</w:t>
+        <w:t>GitHub LInk: https://github.com/naimur-naiyimu/Student_Dropout_Risk_Predictor</w:t>
       </w:r>
     </w:p>
     <w:p>
@@ -241,6 +241,8 @@
         </w:pBdr>
         <w:spacing w:after="200"/>
       </w:pPr>
+      <w:bookmarkStart w:id="0" w:name="_GoBack"/>
+      <w:bookmarkEnd w:id="0"/>
     </w:p>
     <w:p>
       <w:pPr>
@@ -445,18 +447,7 @@
           <w:sz w:val="22"/>
           <w:szCs w:val="22"/>
         </w:rPr>
-        <w:t xml:space="preserve">Student dropout is a critical challenge facing higher education institutions worldwide. Early </w:t>
-      </w:r>
-      <w:bookmarkStart w:id="0" w:name="_GoBack"/>
-      <w:bookmarkEnd w:id="0"/>
-      <w:r>
-        <w:rPr>
-          <w:rFonts w:ascii="Arial" w:hAnsi="Arial" w:eastAsia="Arial" w:cs="Arial"/>
-          <w:color w:val="595959"/>
-          <w:sz w:val="22"/>
-          <w:szCs w:val="22"/>
-        </w:rPr>
-        <w:t>identification of at-risk students provides educators and academic advisors with the opportunity to intervene before irreversible disengagement occurs. This report presents a complete end-to-end machine learning pipeline designed to predict the probability of student dropout using a rich dataset of academic, demographic, and socioeconomic features sourced from the UCI Machine Learning Repository.</w:t>
+        <w:t>Student dropout is a critical challenge facing higher education institutions worldwide. Early identification of at-risk students provides educators and academic advisors with the opportunity to intervene before irreversible disengagement occurs. This report presents a complete end-to-end machine learning pipeline designed to predict the probability of student dropout using a rich dataset of academic, demographic, and socioeconomic features sourced from the UCI Machine Learning Repository.</w:t>
       </w:r>
     </w:p>
     <w:p>

</xml_diff>